<commit_message>
Remove axis scoring formula from customer-facing surfaces (Couple Map 'Scored from' + stale weight data; overview docx formula lines)
</commit_message>
<xml_diff>
--- a/public/attune-couple-type-overview.docx
+++ b/public/attune-couple-type-overview.docx
@@ -354,24 +354,6 @@
           </w:p>
           <w:p>
             <w:pPr>
-              <w:spacing w:after="80" w:before="0"/>
-            </w:pPr>
-            <w:r>
-              <w:rPr>
-                <w:rFonts w:ascii="Arial" w:cs="Arial" w:eastAsia="Arial" w:hAnsi="Arial"/>
-                <w:b w:val="false"/>
-                <w:bCs w:val="false"/>
-                <w:i w:val="false"/>
-                <w:iCs w:val="false"/>
-                <w:color w:val="8C7A68"/>
-                <w:sz w:val="16"/>
-                <w:szCs w:val="16"/>
-              </w:rPr>
-              <w:t xml:space="preserve">(Conflict ×55%) + (Stress ×30%) + (Repair ×15%)</w:t>
-            </w:r>
-          </w:p>
-          <w:p>
-            <w:pPr>
               <w:spacing w:after="30" w:before="0"/>
             </w:pPr>
             <w:r>
@@ -386,24 +368,6 @@
                 <w:szCs w:val="19"/>
               </w:rPr>
               <w:t xml:space="preserve">Axis 2: Open ↔ Guarded</w:t>
-            </w:r>
-          </w:p>
-          <w:p>
-            <w:pPr>
-              <w:spacing w:after="0" w:before="0"/>
-            </w:pPr>
-            <w:r>
-              <w:rPr>
-                <w:rFonts w:ascii="Arial" w:cs="Arial" w:eastAsia="Arial" w:hAnsi="Arial"/>
-                <w:b w:val="false"/>
-                <w:bCs w:val="false"/>
-                <w:i w:val="false"/>
-                <w:iCs w:val="false"/>
-                <w:color w:val="8C7A68"/>
-                <w:sz w:val="16"/>
-                <w:szCs w:val="16"/>
-              </w:rPr>
-              <w:t xml:space="preserve">(Expression ×45%) + (Feedback ×30%) + (Needs ×25%)</w:t>
             </w:r>
           </w:p>
         </w:tc>

</xml_diff>